<commit_message>
Add leadership and activites and new resume file
</commit_message>
<xml_diff>
--- a/PearlyLin_Resume.docx
+++ b/PearlyLin_Resume.docx
@@ -1351,7 +1351,16 @@
           <w:sz w:val="21"/>
           <w:szCs w:val="21"/>
         </w:rPr>
-        <w:t xml:space="preserve">Volunteer </w:t>
+        <w:t>Ambassador</w:t>
+      </w:r>
+      <w:r>
+        <w:rPr>
+          <w:b/>
+          <w:bCs/>
+          <w:sz w:val="21"/>
+          <w:szCs w:val="21"/>
+        </w:rPr>
+        <w:t xml:space="preserve"> </w:t>
       </w:r>
       <w:r>
         <w:rPr>
@@ -1372,10 +1381,7 @@
         <w:t>r</w:t>
       </w:r>
       <w:r>
-        <w:t xml:space="preserve"> Generation Office </w:t>
-      </w:r>
-      <w:r>
-        <w:t>Ambassador</w:t>
+        <w:t xml:space="preserve"> Generation Office</w:t>
       </w:r>
       <w:r>
         <w:t xml:space="preserve"> </w:t>

</xml_diff>

<commit_message>
Add work experience and new resume doc
</commit_message>
<xml_diff>
--- a/PearlyLin_Resume.docx
+++ b/PearlyLin_Resume.docx
@@ -301,7 +301,15 @@
         <w:t>Software Automation:</w:t>
       </w:r>
       <w:r>
-        <w:t xml:space="preserve"> Developed and optimized a dynamic query system for FormSG responses using M language, automating data storage and saving 300 man-hours per year. </w:t>
+        <w:t xml:space="preserve"> Developed and optimized a dynamic query system for </w:t>
+      </w:r>
+      <w:proofErr w:type="spellStart"/>
+      <w:r>
+        <w:t>FormSG</w:t>
+      </w:r>
+      <w:proofErr w:type="spellEnd"/>
+      <w:r>
+        <w:t xml:space="preserve"> responses using M language, automating data storage and saving 300 man-hours per year. </w:t>
       </w:r>
     </w:p>
     <w:p>
@@ -344,7 +352,15 @@
         <w:t xml:space="preserve"> </w:t>
       </w:r>
       <w:r>
-        <w:t xml:space="preserve">Enhanced financial and grant databases bot using UIPath, implementing advanced exception handling to ensure operational stability. </w:t>
+        <w:t xml:space="preserve">Enhanced financial and grant databases bot using </w:t>
+      </w:r>
+      <w:proofErr w:type="spellStart"/>
+      <w:r>
+        <w:t>UIPath</w:t>
+      </w:r>
+      <w:proofErr w:type="spellEnd"/>
+      <w:r>
+        <w:t xml:space="preserve">, implementing advanced exception handling to ensure operational stability. </w:t>
       </w:r>
     </w:p>
     <w:p>
@@ -543,7 +559,15 @@
         <w:t xml:space="preserve"> Engineered low-level Windows lifecycle and interruption handling</w:t>
       </w:r>
       <w:r>
-        <w:t xml:space="preserve"> (e,g,. implementing window focus loss detection and automated pause states on system interrupts like Ctrl-Alt-Del</w:t>
+        <w:t xml:space="preserve"> (</w:t>
+      </w:r>
+      <w:proofErr w:type="spellStart"/>
+      <w:r>
+        <w:t>e,g</w:t>
+      </w:r>
+      <w:proofErr w:type="spellEnd"/>
+      <w:r>
+        <w:t>,. implementing window focus loss detection and automated pause states on system interrupts like Ctrl-Alt-Del</w:t>
       </w:r>
       <w:r>
         <w:t>)</w:t>
@@ -970,7 +994,23 @@
           <w:color w:val="7A7A7A"/>
         </w:rPr>
         <w:tab/>
-        <w:t>Mar 2023 – Dec 2025</w:t>
+        <w:t>Mar 202</w:t>
+      </w:r>
+      <w:r>
+        <w:rPr>
+          <w:i/>
+          <w:iCs/>
+          <w:color w:val="7A7A7A"/>
+        </w:rPr>
+        <w:t>1</w:t>
+      </w:r>
+      <w:r>
+        <w:rPr>
+          <w:i/>
+          <w:iCs/>
+          <w:color w:val="7A7A7A"/>
+        </w:rPr>
+        <w:t xml:space="preserve"> – Dec 2025</w:t>
       </w:r>
     </w:p>
     <w:p>
@@ -1400,7 +1440,7 @@
           <w:iCs/>
           <w:color w:val="7A7A7A"/>
         </w:rPr>
-        <w:t>date</w:t>
+        <w:t>2024 - Current</w:t>
       </w:r>
     </w:p>
     <w:p>
@@ -1762,7 +1802,23 @@
           <w:sz w:val="18"/>
           <w:szCs w:val="18"/>
         </w:rPr>
-        <w:t>Singapore Institute of Technology, DigiPen Institute of Technology, Singapore</w:t>
+        <w:t xml:space="preserve">Singapore Institute of Technology, </w:t>
+      </w:r>
+      <w:proofErr w:type="spellStart"/>
+      <w:r>
+        <w:rPr>
+          <w:sz w:val="18"/>
+          <w:szCs w:val="18"/>
+        </w:rPr>
+        <w:t>DigiPen</w:t>
+      </w:r>
+      <w:proofErr w:type="spellEnd"/>
+      <w:r>
+        <w:rPr>
+          <w:sz w:val="18"/>
+          <w:szCs w:val="18"/>
+        </w:rPr>
+        <w:t xml:space="preserve"> Institute of Technology, Singapore</w:t>
       </w:r>
       <w:r>
         <w:rPr>
@@ -1989,12 +2045,37 @@
         </w:rPr>
         <w:t xml:space="preserve">Tools &amp; Frameworks: </w:t>
       </w:r>
+      <w:proofErr w:type="spellStart"/>
       <w:r>
         <w:rPr>
           <w:sz w:val="16"/>
           <w:szCs w:val="16"/>
         </w:rPr>
-        <w:t>UIPath (RPA), Dear IMGui, Git, GitHub, Power Query, Database System Virtualization</w:t>
+        <w:t>UIPath</w:t>
+      </w:r>
+      <w:proofErr w:type="spellEnd"/>
+      <w:r>
+        <w:rPr>
+          <w:sz w:val="16"/>
+          <w:szCs w:val="16"/>
+        </w:rPr>
+        <w:t xml:space="preserve"> (RPA), Dear </w:t>
+      </w:r>
+      <w:proofErr w:type="spellStart"/>
+      <w:r>
+        <w:rPr>
+          <w:sz w:val="16"/>
+          <w:szCs w:val="16"/>
+        </w:rPr>
+        <w:t>IMGui</w:t>
+      </w:r>
+      <w:proofErr w:type="spellEnd"/>
+      <w:r>
+        <w:rPr>
+          <w:sz w:val="16"/>
+          <w:szCs w:val="16"/>
+        </w:rPr>
+        <w:t>, Git, GitHub, Power Query, Database System Virtualization</w:t>
       </w:r>
     </w:p>
     <w:p>

</xml_diff>